<commit_message>
Audit reviewer findings and correct validation claims with reproducible diagnostics
</commit_message>
<xml_diff>
--- a/paper/yang_2026_extension/Coupled_Hydrodynamic_FourLeg_Sea_Landing_Manuscript.docx
+++ b/paper/yang_2026_extension/Coupled_Hydrodynamic_FourLeg_Sea_Landing_Manuscript.docx
@@ -307,7 +307,7 @@
           <w:rFonts w:ascii="Times New Roman" w:hAnsi="Times New Roman" w:eastAsia="SimSun"/>
           <w:sz w:val="21"/>
         </w:rPr>
-        <w:t>where η=[x,y,z,phi,theta,psi]ᵀ denotes surge, sway, heave, roll, pitch and yaw. The rigid-body mass and hydrostatic matrices are M and Kₕ. The supplied additional linear damping is C_ext=0 in every calculation; frequency-dependent radiation damping is retained through the memory term and is not part of C_ext. Wave, plume and contact loads are denoted by Fwave, Fplume and Fcontact.</w:t>
+        <w:t>where η=[x,y,z,φ,θ,ψ]ᵀ denotes surge, sway, heave, roll, pitch and yaw. The rigid-body mass and hydrostatic matrices are M and Kₕ. The supplied additional linear damping is C_ext=0 in every calculation; frequency-dependent radiation damping is retained through the memory term and is not part of C_ext. Wave, plume and contact loads are denoted by Fwave, Fplume and Fcontact.</w:t>
       </w:r>
     </w:p>
     <w:p>
@@ -365,7 +365,7 @@
           <w:rFonts w:ascii="Times New Roman" w:hAnsi="Times New Roman" w:eastAsia="SimSun"/>
           <w:sz w:val="21"/>
         </w:rPr>
-        <w:t>In the numerical model, the positive-semidefinite 0.2-2.0 rad/s radiation band is represented by auxiliary cosine and sine states,</w:t>
+        <w:t>In the numerical model, the heave-roll-pitch submatrix is positive semidefinite over the selected 0.2-2.0 rad/s radiation band, which is represented by auxiliary cosine and sine states,</w:t>
       </w:r>
     </w:p>
     <w:p>
@@ -415,6 +415,19 @@
     </w:p>
     <w:p>
       <w:pPr>
+        <w:keepNext w:val="0"/>
+        <w:keepLines w:val="0"/>
+      </w:pPr>
+      <w:r>
+        <w:rPr>
+          <w:rFonts w:ascii="Times New Roman" w:hAnsi="Times New Roman" w:eastAsia="SimSun"/>
+          <w:sz w:val="21"/>
+        </w:rPr>
+        <w:t>Raw-coefficient reciprocity is checked before symmetrization using work-preserving translation and length-scaled rotation coordinates, with a reference length of 120 m. The Frobenius norm of the difference between the scaled damping matrix and its transpose, divided by the norm of that matrix, reaches 0.803% up to 2 rad/s and 36.65% at 5 rad/s. The full six-coordinate damping matrix also has small negative eigenvalues within the retained band; positivity of the selected three-coordinate submatrix cannot establish six-coordinate passivity. Excluding unreliable high-frequency damping is a numerical restriction, and consistency of the retained memory kernel with the separate added-mass estimate remains unverified.</w:t>
+      </w:r>
+    </w:p>
+    <w:p>
+      <w:pPr>
         <w:pStyle w:val="Heading2"/>
       </w:pPr>
       <w:r>
@@ -431,7 +444,7 @@
           <w:rFonts w:ascii="Times New Roman" w:hAnsi="Times New Roman" w:eastAsia="SimSun"/>
           <w:sz w:val="21"/>
         </w:rPr>
-        <w:t>Let rₚ=[xₚ,yₚ,zₚ]ᵀ be a point fixed to the platform and measured from the hydrodynamic reference point. Under the small-rotation assumption, the point displacement is uₚ=u_R+theta×rₚ. In component form,</w:t>
+        <w:t>Let rₚ=[xₚ,yₚ,zₚ]ᵀ be a point fixed to the platform and measured from the hydrodynamic reference point. Under the small-rotation assumption, the point displacement is uₚ=u_R+θ×rₚ. In component form,</w:t>
       </w:r>
     </w:p>
     <w:p>
@@ -579,7 +592,7 @@
           <w:rFonts w:ascii="Times New Roman" w:hAnsi="Times New Roman" w:eastAsia="SimSun"/>
           <w:sz w:val="21"/>
         </w:rPr>
-        <w:t>The same phase epsilon_n is used for every deck channel at frequency ω_n. The hydrodynamic response is interpolated to a separate stochastic grid with Δωsimeq0.004995 rad/s. Its nominal repeat period is 1257.95 s, longer than the 600 s record, so the earlier 62.83 s repetition associated with a 0.1 rad/s grid cannot occur. Each sea-state-heading condition contains 1000 deterministic phase sets. The P95 of each record maximum is accompanied by a 95% percentile-bootstrap interval based on 2000 resamples.</w:t>
+        <w:t>The same phase ε_n is used for every deck channel at frequency ω_n. The hydrodynamic response is interpolated to a separate stochastic grid with Δω≈0.004995 rad/s. Its nominal repeat period is 1257.95 s, longer than the 600 s record, so the earlier 62.83 s repetition associated with a 0.1 rad/s grid cannot occur. Each sea-state-heading condition contains 1000 deterministic phase sets. The P95 of each record maximum is accompanied by a 95% percentile-bootstrap interval based on 2000 resamples.</w:t>
       </w:r>
     </w:p>
     <w:p>
@@ -853,7 +866,7 @@
           <w:rFonts w:ascii="Times New Roman" w:hAnsi="Times New Roman" w:eastAsia="SimSun"/>
           <w:sz w:val="21"/>
         </w:rPr>
-        <w:t>Fine-grid contact loads are transferred back by conservative interval averaging. Heave, roll and pitch are updated because the generated barge has hydrostatic restoring in these coordinates. Surge, sway and yaw have neither mooring nor dynamic-positioning restoring in the supplied model and are therefore held fixed. Their contact-wrench components are calculated and audited but are not injected. The calculation should consequently be read as three-coordinate platform feedback, not a fully closed six-degree-of-freedom station-keeping model.</w:t>
+        <w:t>Fine-grid contact loads are transferred back by conservative interval averaging. The feedback calculation updates heave, roll and pitch and imposes a kinematic constraint on surge, sway and yaw. Absence of mooring or dynamic-positioning restoring does not physically constrain these coordinates: an unconstrained platform would respond to the horizontal forces and yaw moment. Their contact-wrench components are calculated and audited but are not injected into the platform equation. The results therefore describe a horizontally constrained platform, with the omitted wrench carried by the constraint; they do not establish the response of a freely drifting or station-kept platform.</w:t>
       </w:r>
     </w:p>
     <w:p>
@@ -2074,7 +2087,33 @@
           <w:rFonts w:ascii="Times New Roman" w:hAnsi="Times New Roman" w:eastAsia="SimSun"/>
           <w:sz w:val="21"/>
         </w:rPr>
+        <w:t>The archived wave-screening spectra are normalized within 0.2-5.0 rad/s. A separate full-spectrum normalization audit, applied to the same archived realizations and transfer functions, changes the in-band linear response amplitudes by at most 0.079%. This tests the normalization choice only; it does not estimate response outside the computed band. The landing feedback operator uses a shorter radiation and wave grid ending at 2.0 rad/s. Its truncation requires a separate assessment and cannot inherit the wave-screening result.</w:t>
+      </w:r>
+    </w:p>
+    <w:p>
+      <w:pPr>
+        <w:keepNext w:val="0"/>
+        <w:keepLines w:val="0"/>
+      </w:pPr>
+      <w:r>
+        <w:rPr>
+          <w:rFonts w:ascii="Times New Roman" w:hAnsi="Times New Roman" w:eastAsia="SimSun"/>
+          <w:sz w:val="21"/>
+        </w:rPr>
         <w:t>Two geometric layouts are evaluated. Landing statistics use the 6.926 m-radius footprint of the multibody vehicle. The four [±9,±9] m points remain in the data file as generic deck probes and are never labelled as the vehicle feet. A condition is inside the linear screen only if the P95 maximum tilt does not exceed 5 deg and no deck edge enters the mean free surface in any realization. This screen is diagnostic: failure indicates that fixed-wetted-surface linear results should not be used quantitatively.</w:t>
+      </w:r>
+    </w:p>
+    <w:p>
+      <w:pPr>
+        <w:keepNext w:val="0"/>
+        <w:keepLines w:val="0"/>
+      </w:pPr>
+      <w:r>
+        <w:rPr>
+          <w:rFonts w:ascii="Times New Roman" w:hAnsi="Times New Roman" w:eastAsia="SimSun"/>
+          <w:sz w:val="21"/>
+        </w:rPr>
+        <w:t>Passing this geometric screen does not establish a dry deck: local incident and diffracted wave elevation is not included in the deck-edge clearance. The 41 conditions passing the screen are therefore a preliminary subset, not confirmed wetting-free conditions.</w:t>
       </w:r>
     </w:p>
     <w:p>
@@ -3751,7 +3790,7 @@
           <w:rFonts w:ascii="Times New Roman" w:hAnsi="Times New Roman" w:eastAsia="SimSun"/>
           <w:sz w:val="21"/>
         </w:rPr>
-        <w:t>Figure 4. Present barge hydrodynamics. Response operators use the medium grid. The high-frequency panels show the finite-cutoff added-mass estimate and radiation-memory reconstruction. The mesh bars retain the failed 5% criterion.</w:t>
+        <w:t>Figure 4. Present barge hydrodynamics. Response operators use the medium grid. The lower-left panel shows the finite-cutoff added-mass tail. The lower-right mesh bars retain the failed 5% criterion.</w:t>
       </w:r>
     </w:p>
     <w:p>
@@ -3764,7 +3803,7 @@
           <w:rFonts w:ascii="Times New Roman" w:hAnsi="Times New Roman" w:eastAsia="SimSun"/>
           <w:sz w:val="21"/>
         </w:rPr>
-        <w:t>Refinement does not support the label mesh-converged. The maximum selected change is 15.46% from coarse to medium and 5.88% from medium to fine, both above the prescribed 5% threshold. The second value is close to the threshold, but it is not rounded into a pass. The medium mesh is used for subsequent calculations because it is the only completed mesh with all seven headings and the dense active frequency grid; this choice carries the measured 5.88% residual refinement uncertainty.</w:t>
+        <w:t>Refinement does not support the label mesh-converged. The maximum selected change is 15.46% from coarse to medium and 5.88% from medium to fine, both above the prescribed 5% threshold. The second value is close to the threshold, but it is not rounded into a pass. The medium mesh is used for subsequent calculations because it is the only completed mesh with all seven headings and the dense active frequency grid. The 5.88% value is an observed difference at the selected frequencies, not an estimate or bound of discretization uncertainty. The fine grid does not resolve the sampled resonance near 0.775 rad/s, so the peak response remains unverified by this comparison.</w:t>
       </w:r>
     </w:p>
     <w:p>
@@ -3777,7 +3816,7 @@
           <w:rFonts w:ascii="Times New Roman" w:hAnsi="Times New Roman" w:eastAsia="SimSun"/>
           <w:sz w:val="21"/>
         </w:rPr>
-        <w:t>The finite-cutoff estimates of A_33, A_44 and A_55 are 108.315 million kg, 10.303 billion kg m2 and 91.865 billion kg m2. Their relative ranges over the final five samples are 1.638%, 0.220% and 0.605%, respectively. Finite-band retardation-kernel round-trip RMS errors for the same diagonal terms are 3.19%, 6.51% and 3.65%. The active 0.2-2.0 rad/s radiation matrix remains positive semidefinite, with a minimum eigenvalue of 88,931 kg/s. Numerical negative eigenvalues appear in the 3-5 rad/s tail; that tail is therefore used only for the finite-cutoff added-mass estimate, not for time-domain radiation damping.</w:t>
+        <w:t>The finite-cutoff estimates of A_33, A_44 and A_55 are 108.315 million kg, 10.303 billion kg m2 and 91.865 billion kg m2. Their relative ranges over the final five samples are 1.638%, 0.220% and 0.605%, respectively. Finite-band retardation-kernel round-trip RMS errors for the same diagonal terms are 3.19%, 6.51% and 3.65%. The heave-roll-pitch radiation submatrix remains positive semidefinite over 0.2-2.0 rad/s. Numerical negative eigenvalues appear in the 3-5 rad/s tail; that tail is therefore used only for the finite-cutoff added-mass estimate, not for time-domain radiation damping.</w:t>
       </w:r>
     </w:p>
     <w:p>

</xml_diff>